<commit_message>
feat: aba "Marca" no Admin — Master pode trocar a logo do sistema
- Novo BrandingProvider (logo customizada persistida no localStorage).
- Aba "Marca" na tela de Administração (já restrita ao Master): envia
  uma imagem para substituir a logo, com preview e botão de restaurar
  o padrão. Usa redimensionamento automático da imagem.
- Sidebar e tela de login passam a usar a logo customizada quando há
  uma definida (caixa branca neutra); senão, mantêm o escudo padrão.
- Documentação .docx atualizada (Admin agora com quatro abas).

🤖 Generated with [Claude Code](https://claude.com/claude-code)

Co-Authored-By: Claude Opus 4.7 <noreply@anthropic.com>
</commit_message>
<xml_diff>
--- a/docs/FROTA-PML-Documentacao-e-Tutorial.docx
+++ b/docs/FROTA-PML-Documentacao-e-Tutorial.docx
@@ -87,7 +87,7 @@
         </w:rPr>
         <w:t xml:space="preserve">Repositório: </w:t>
       </w:r>
-      <w:hyperlink w:history="1" r:id="rIdweurcfaryhbmqrw_hlnix">
+      <w:hyperlink w:history="1" r:id="rIdij_-1mgxvp6rzb7q2bi5r">
         <w:r>
           <w:rPr>
             <w:rStyle w:val="Hyperlink"/>
@@ -1720,7 +1720,7 @@
           <w:sz w:val="22"/>
           <w:szCs w:val="22"/>
         </w:rPr>
-        <w:t xml:space="preserve">Tela "Administração", com três abas:</w:t>
+        <w:t xml:space="preserve">Tela "Administração", com quatro abas:</w:t>
       </w:r>
     </w:p>
     <w:p>
@@ -1799,6 +1799,32 @@
           <w:szCs w:val="22"/>
         </w:rPr>
         <w:t xml:space="preserve">secretarias e demais lotações da prefeitura. Um órgão só pode ser excluído se não houver usuários, veículos ou superintendências vinculados a ele.</w:t>
+      </w:r>
+    </w:p>
+    <w:p>
+      <w:pPr>
+        <w:pStyle w:val="ListParagraph"/>
+        <w:numPr>
+          <w:ilvl w:val="0"/>
+          <w:numId w:val="1"/>
+        </w:numPr>
+        <w:spacing w:after="60"/>
+      </w:pPr>
+      <w:r>
+        <w:rPr>
+          <w:b/>
+          <w:bCs/>
+          <w:sz w:val="22"/>
+          <w:szCs w:val="22"/>
+        </w:rPr>
+        <w:t xml:space="preserve">Marca: </w:t>
+      </w:r>
+      <w:r>
+        <w:rPr>
+          <w:sz w:val="22"/>
+          <w:szCs w:val="22"/>
+        </w:rPr>
+        <w:t xml:space="preserve">permite trocar a logo exibida no sistema (cabeçalho do menu lateral e tela de login). Envie um arquivo de imagem (de preferência PNG quadrado com fundo transparente) ou restaure a logo padrão. Disponível apenas para o Master.</w:t>
       </w:r>
     </w:p>
     <w:p>
@@ -3719,7 +3745,7 @@
         </w:rPr>
         <w:t xml:space="preserve">Repositório do código-fonte: </w:t>
       </w:r>
-      <w:hyperlink w:history="1" r:id="rIdyl3w6e7owoyqi2ntuyrbs">
+      <w:hyperlink w:history="1" r:id="rIdkzbtdq00jyobicxyiqmqh">
         <w:r>
           <w:rPr>
             <w:rStyle w:val="Hyperlink"/>

</xml_diff>